<commit_message>
Update FullStack principal SQL DBA CV
</commit_message>
<xml_diff>
--- a/Output/Pedro_Gutierrez_FullStack_Principal_SQL_DBA_CV.docx
+++ b/Output/Pedro_Gutierrez_FullStack_Principal_SQL_DBA_CV.docx
@@ -4,71 +4,108 @@
   <w:body>
     <w:p>
       <w:pPr>
-        <w:pStyle w:val="Title"/>
+        <w:spacing w:after="10"/>
         <w:jc w:val="center"/>
       </w:pPr>
       <w:r>
+        <w:rPr>
+          <w:rFonts w:ascii="Aptos Display" w:hAnsi="Aptos Display"/>
+          <w:b/>
+          <w:i w:val="0"/>
+          <w:color w:val="1F4E79"/>
+          <w:sz w:val="36"/>
+        </w:rPr>
         <w:t>PEDRO JAVIER GUTIERREZ ARMAS</w:t>
       </w:r>
     </w:p>
     <w:p>
       <w:pPr>
-        <w:spacing w:after="0"/>
+        <w:spacing w:after="20"/>
         <w:jc w:val="center"/>
       </w:pPr>
       <w:r>
         <w:rPr>
+          <w:rFonts w:ascii="Aptos" w:hAnsi="Aptos"/>
           <w:b/>
           <w:i w:val="0"/>
-          <w:sz w:val="21"/>
+          <w:color w:val="404040"/>
+          <w:sz w:val="19"/>
         </w:rPr>
-        <w:t>Principal SQL Database Administrator | SQL Server DBA | T-SQL Performance Tuning</w:t>
+        <w:t>Principal SQL Database Administrator | Production Support and Performance Engineering</w:t>
       </w:r>
     </w:p>
     <w:p>
       <w:pPr>
-        <w:spacing w:after="100"/>
+        <w:spacing w:after="120"/>
         <w:jc w:val="center"/>
       </w:pPr>
       <w:r>
         <w:rPr>
+          <w:rFonts w:ascii="Aptos" w:hAnsi="Aptos"/>
           <w:b w:val="0"/>
           <w:i w:val="0"/>
-          <w:sz w:val="18"/>
+          <w:color w:val="4C4C4C"/>
+          <w:sz w:val="17"/>
         </w:rPr>
         <w:t>San Jose, Costa Rica | +506 6351-5860 | pj13eros@hotmail.com | linkedin.com/in/pedrogutierrez13</w:t>
       </w:r>
     </w:p>
     <w:p>
       <w:pPr>
-        <w:pStyle w:val="Heading1"/>
-        <w:spacing w:before="160" w:after="60"/>
+        <w:keepNext/>
+        <w:spacing w:before="140" w:after="60"/>
+        <w:pBdr>
+          <w:bottom w:val="single" w:sz="4" w:space="2" w:color="BDD7EE"/>
+        </w:pBdr>
       </w:pPr>
       <w:r>
+        <w:rPr>
+          <w:rFonts w:ascii="Aptos Display" w:hAnsi="Aptos Display"/>
+          <w:b/>
+          <w:i w:val="0"/>
+          <w:color w:val="1F4E79"/>
+          <w:sz w:val="20"/>
+        </w:rPr>
         <w:t>PROFESSIONAL SUMMARY</w:t>
       </w:r>
     </w:p>
     <w:p>
       <w:pPr>
-        <w:spacing w:after="80"/>
+        <w:spacing w:line="250" w:lineRule="auto" w:after="80"/>
       </w:pPr>
       <w:r>
-        <w:t>Principal SQL Server DBA, SQL Developer, and Data Engineer with 15+ years of experience designing, administering, optimizing, and maintaining data platforms for reporting, operational systems, ETL/ELT, data warehousing, and BI. Strong background in Microsoft SQL Server, advanced T-SQL, stored procedures, indexing, query optimization, database maintenance, production troubleshooting, data migrations, and stakeholder-facing delivery. Experienced working in remote Agile environments with autonomy, supporting complex SQL Server and Azure-based data environments, defining database practices, documenting technical processes, and using automation and AI-assisted development tools such as Cursor and PR review bots.</w:t>
+        <w:rPr>
+          <w:rFonts w:ascii="Aptos" w:hAnsi="Aptos"/>
+          <w:b w:val="0"/>
+          <w:i w:val="0"/>
+          <w:sz w:val="18"/>
+        </w:rPr>
+        <w:t>Principal-level SQL Server DBA, database engineer, and SQL developer with 15+ years of experience administering, securing, developing, optimizing, and supporting enterprise databases and data platforms. Current hands-on experience supporting SQL Server on AWS RDS across production and non-production environments, with strong expertise in advanced T-SQL, indexing, execution analysis, backup and restore, SQL Agent monitoring, database security, production incident response, and controlled deployments. Proven record of improving query execution time by up to 50%, establishing database access and operating standards, leading data recovery and migration work, documenting repeatable procedures, and partnering with developers and stakeholders to resolve complex database issues.</w:t>
       </w:r>
     </w:p>
     <w:p>
       <w:pPr>
-        <w:pStyle w:val="Heading1"/>
-        <w:spacing w:before="160" w:after="60"/>
+        <w:keepNext/>
+        <w:spacing w:before="140" w:after="60"/>
+        <w:pBdr>
+          <w:bottom w:val="single" w:sz="4" w:space="2" w:color="BDD7EE"/>
+        </w:pBdr>
       </w:pPr>
       <w:r>
+        <w:rPr>
+          <w:rFonts w:ascii="Aptos Display" w:hAnsi="Aptos Display"/>
+          <w:b/>
+          <w:i w:val="0"/>
+          <w:color w:val="1F4E79"/>
+          <w:sz w:val="20"/>
+        </w:rPr>
         <w:t>TECHNICAL SKILLS</w:t>
       </w:r>
     </w:p>
     <w:tbl>
       <w:tblPr>
-        <w:tblStyle w:val="TableGrid"/>
         <w:tblW w:type="auto" w:w="0"/>
+        <w:tblLayout w:type="fixed"/>
         <w:tblLook w:firstColumn="1" w:firstRow="1" w:lastColumn="0" w:lastRow="0" w:noHBand="0" w:noVBand="1" w:val="04A0"/>
       </w:tblPr>
       <w:tblGrid>
@@ -78,27 +115,35 @@
       <w:tr>
         <w:tc>
           <w:tcPr>
-            <w:tcW w:type="dxa" w:w="2520"/>
+            <w:tcW w:type="dxa" w:w="2477"/>
+            <w:vAlign w:val="center"/>
             <w:shd w:fill="1F4E79"/>
             <w:tcBorders>
-              <w:top w:val="single" w:sz="4" w:space="0" w:color="D9D9D9"/>
-              <w:left w:val="single" w:sz="4" w:space="0" w:color="D9D9D9"/>
-              <w:bottom w:val="single" w:sz="4" w:space="0" w:color="D9D9D9"/>
-              <w:right w:val="single" w:sz="4" w:space="0" w:color="D9D9D9"/>
-              <w:insideH w:val="single" w:sz="4" w:space="0" w:color="D9D9D9"/>
-              <w:insideV w:val="single" w:sz="4" w:space="0" w:color="D9D9D9"/>
+              <w:top w:val="single" w:sz="4" w:color="D9D9D9"/>
+              <w:left w:val="single" w:sz="4" w:color="D9D9D9"/>
+              <w:bottom w:val="single" w:sz="4" w:color="D9D9D9"/>
+              <w:right w:val="single" w:sz="4" w:color="D9D9D9"/>
+              <w:insideH w:val="single" w:sz="4" w:color="D9D9D9"/>
+              <w:insideV w:val="single" w:sz="4" w:color="D9D9D9"/>
             </w:tcBorders>
             <w:tcMar>
-              <w:top w:w="70" w:type="dxa"/>
-              <w:start w:w="90" w:type="dxa"/>
-              <w:bottom w:w="70" w:type="dxa"/>
-              <w:end w:w="90" w:type="dxa"/>
+              <w:top w:w="65" w:type="dxa"/>
+              <w:start w:w="80" w:type="dxa"/>
+              <w:bottom w:w="65" w:type="dxa"/>
+              <w:end w:w="80" w:type="dxa"/>
             </w:tcMar>
           </w:tcPr>
           <w:p>
+            <w:pPr>
+              <w:spacing w:after="0"/>
+            </w:pPr>
+            <w:r/>
             <w:r>
               <w:rPr>
+                <w:rFonts w:ascii="Aptos" w:hAnsi="Aptos"/>
                 <w:b/>
+                <w:i w:val="0"/>
+                <w:color w:val="FFFFFF"/>
                 <w:sz w:val="17"/>
               </w:rPr>
               <w:t>Area</w:t>
@@ -107,30 +152,38 @@
         </w:tc>
         <w:tc>
           <w:tcPr>
-            <w:tcW w:type="dxa" w:w="8136"/>
+            <w:tcW w:type="dxa" w:w="8179"/>
+            <w:vAlign w:val="center"/>
             <w:shd w:fill="1F4E79"/>
             <w:tcBorders>
-              <w:top w:val="single" w:sz="4" w:space="0" w:color="D9D9D9"/>
-              <w:left w:val="single" w:sz="4" w:space="0" w:color="D9D9D9"/>
-              <w:bottom w:val="single" w:sz="4" w:space="0" w:color="D9D9D9"/>
-              <w:right w:val="single" w:sz="4" w:space="0" w:color="D9D9D9"/>
-              <w:insideH w:val="single" w:sz="4" w:space="0" w:color="D9D9D9"/>
-              <w:insideV w:val="single" w:sz="4" w:space="0" w:color="D9D9D9"/>
+              <w:top w:val="single" w:sz="4" w:color="D9D9D9"/>
+              <w:left w:val="single" w:sz="4" w:color="D9D9D9"/>
+              <w:bottom w:val="single" w:sz="4" w:color="D9D9D9"/>
+              <w:right w:val="single" w:sz="4" w:color="D9D9D9"/>
+              <w:insideH w:val="single" w:sz="4" w:color="D9D9D9"/>
+              <w:insideV w:val="single" w:sz="4" w:color="D9D9D9"/>
             </w:tcBorders>
             <w:tcMar>
-              <w:top w:w="70" w:type="dxa"/>
-              <w:start w:w="90" w:type="dxa"/>
-              <w:bottom w:w="70" w:type="dxa"/>
-              <w:end w:w="90" w:type="dxa"/>
+              <w:top w:w="65" w:type="dxa"/>
+              <w:start w:w="80" w:type="dxa"/>
+              <w:bottom w:w="65" w:type="dxa"/>
+              <w:end w:w="80" w:type="dxa"/>
             </w:tcMar>
           </w:tcPr>
           <w:p>
+            <w:pPr>
+              <w:spacing w:after="0"/>
+            </w:pPr>
+            <w:r/>
             <w:r>
               <w:rPr>
+                <w:rFonts w:ascii="Aptos" w:hAnsi="Aptos"/>
                 <w:b/>
+                <w:i w:val="0"/>
+                <w:color w:val="FFFFFF"/>
                 <w:sz w:val="17"/>
               </w:rPr>
-              <w:t>Tools and Practices</w:t>
+              <w:t>Tools and practices</w:t>
             </w:r>
           </w:p>
         </w:tc>
@@ -138,62 +191,71 @@
       <w:tr>
         <w:tc>
           <w:tcPr>
-            <w:tcW w:type="dxa" w:w="2520"/>
+            <w:tcW w:type="dxa" w:w="2477"/>
+            <w:vAlign w:val="center"/>
             <w:tcBorders>
-              <w:top w:val="single" w:sz="4" w:space="0" w:color="D9D9D9"/>
-              <w:left w:val="single" w:sz="4" w:space="0" w:color="D9D9D9"/>
-              <w:bottom w:val="single" w:sz="4" w:space="0" w:color="D9D9D9"/>
-              <w:right w:val="single" w:sz="4" w:space="0" w:color="D9D9D9"/>
-              <w:insideH w:val="single" w:sz="4" w:space="0" w:color="D9D9D9"/>
-              <w:insideV w:val="single" w:sz="4" w:space="0" w:color="D9D9D9"/>
+              <w:top w:val="single" w:sz="4" w:color="D9D9D9"/>
+              <w:left w:val="single" w:sz="4" w:color="D9D9D9"/>
+              <w:bottom w:val="single" w:sz="4" w:color="D9D9D9"/>
+              <w:right w:val="single" w:sz="4" w:color="D9D9D9"/>
+              <w:insideH w:val="single" w:sz="4" w:color="D9D9D9"/>
+              <w:insideV w:val="single" w:sz="4" w:color="D9D9D9"/>
             </w:tcBorders>
             <w:tcMar>
-              <w:top w:w="70" w:type="dxa"/>
-              <w:start w:w="90" w:type="dxa"/>
-              <w:bottom w:w="70" w:type="dxa"/>
-              <w:end w:w="90" w:type="dxa"/>
+              <w:top w:w="65" w:type="dxa"/>
+              <w:start w:w="80" w:type="dxa"/>
+              <w:bottom w:w="65" w:type="dxa"/>
+              <w:end w:w="80" w:type="dxa"/>
             </w:tcMar>
           </w:tcPr>
           <w:p>
             <w:pPr>
-              <w:spacing w:after="0"/>
+              <w:spacing w:after="0" w:line="240" w:lineRule="auto"/>
             </w:pPr>
+            <w:r/>
             <w:r>
               <w:rPr>
+                <w:rFonts w:ascii="Aptos" w:hAnsi="Aptos"/>
                 <w:b/>
-                <w:sz w:val="17"/>
+                <w:i w:val="0"/>
+                <w:sz w:val="16"/>
               </w:rPr>
-              <w:t>SQL Server Administration</w:t>
+              <w:t>SQL Server operations</w:t>
             </w:r>
           </w:p>
         </w:tc>
         <w:tc>
           <w:tcPr>
-            <w:tcW w:type="dxa" w:w="8136"/>
+            <w:tcW w:type="dxa" w:w="8179"/>
+            <w:vAlign w:val="center"/>
             <w:tcBorders>
-              <w:top w:val="single" w:sz="4" w:space="0" w:color="D9D9D9"/>
-              <w:left w:val="single" w:sz="4" w:space="0" w:color="D9D9D9"/>
-              <w:bottom w:val="single" w:sz="4" w:space="0" w:color="D9D9D9"/>
-              <w:right w:val="single" w:sz="4" w:space="0" w:color="D9D9D9"/>
-              <w:insideH w:val="single" w:sz="4" w:space="0" w:color="D9D9D9"/>
-              <w:insideV w:val="single" w:sz="4" w:space="0" w:color="D9D9D9"/>
+              <w:top w:val="single" w:sz="4" w:color="D9D9D9"/>
+              <w:left w:val="single" w:sz="4" w:color="D9D9D9"/>
+              <w:bottom w:val="single" w:sz="4" w:color="D9D9D9"/>
+              <w:right w:val="single" w:sz="4" w:color="D9D9D9"/>
+              <w:insideH w:val="single" w:sz="4" w:color="D9D9D9"/>
+              <w:insideV w:val="single" w:sz="4" w:color="D9D9D9"/>
             </w:tcBorders>
             <w:tcMar>
-              <w:top w:w="70" w:type="dxa"/>
-              <w:start w:w="90" w:type="dxa"/>
-              <w:bottom w:w="70" w:type="dxa"/>
-              <w:end w:w="90" w:type="dxa"/>
+              <w:top w:w="65" w:type="dxa"/>
+              <w:start w:w="80" w:type="dxa"/>
+              <w:bottom w:w="65" w:type="dxa"/>
+              <w:end w:w="80" w:type="dxa"/>
             </w:tcMar>
           </w:tcPr>
           <w:p>
             <w:pPr>
-              <w:spacing w:after="0"/>
+              <w:spacing w:after="0" w:line="240" w:lineRule="auto"/>
             </w:pPr>
+            <w:r/>
             <w:r>
               <w:rPr>
-                <w:sz w:val="17"/>
+                <w:rFonts w:ascii="Aptos" w:hAnsi="Aptos"/>
+                <w:b w:val="0"/>
+                <w:i w:val="0"/>
+                <w:sz w:val="16"/>
               </w:rPr>
-              <w:t>SQL Server, database health management, maintenance routines, production support, migration support, multi-database environments, Azure-based environments</w:t>
+              <w:t>AWS RDS, production, development and staging environments, SSMS, DBeaver, SQL Agent, Database Mail, maintenance, backup and restore, monitoring and incident support</w:t>
             </w:r>
           </w:p>
         </w:tc>
@@ -201,62 +263,73 @@
       <w:tr>
         <w:tc>
           <w:tcPr>
-            <w:tcW w:type="dxa" w:w="2520"/>
+            <w:tcW w:type="dxa" w:w="2477"/>
+            <w:vAlign w:val="center"/>
             <w:tcBorders>
-              <w:top w:val="single" w:sz="4" w:space="0" w:color="D9D9D9"/>
-              <w:left w:val="single" w:sz="4" w:space="0" w:color="D9D9D9"/>
-              <w:bottom w:val="single" w:sz="4" w:space="0" w:color="D9D9D9"/>
-              <w:right w:val="single" w:sz="4" w:space="0" w:color="D9D9D9"/>
-              <w:insideH w:val="single" w:sz="4" w:space="0" w:color="D9D9D9"/>
-              <w:insideV w:val="single" w:sz="4" w:space="0" w:color="D9D9D9"/>
+              <w:top w:val="single" w:sz="4" w:color="D9D9D9"/>
+              <w:left w:val="single" w:sz="4" w:color="D9D9D9"/>
+              <w:bottom w:val="single" w:sz="4" w:color="D9D9D9"/>
+              <w:right w:val="single" w:sz="4" w:color="D9D9D9"/>
+              <w:insideH w:val="single" w:sz="4" w:color="D9D9D9"/>
+              <w:insideV w:val="single" w:sz="4" w:color="D9D9D9"/>
             </w:tcBorders>
             <w:tcMar>
-              <w:top w:w="70" w:type="dxa"/>
-              <w:start w:w="90" w:type="dxa"/>
-              <w:bottom w:w="70" w:type="dxa"/>
-              <w:end w:w="90" w:type="dxa"/>
+              <w:top w:w="65" w:type="dxa"/>
+              <w:start w:w="80" w:type="dxa"/>
+              <w:bottom w:w="65" w:type="dxa"/>
+              <w:end w:w="80" w:type="dxa"/>
             </w:tcMar>
+            <w:shd w:fill="F3F7FA"/>
           </w:tcPr>
           <w:p>
             <w:pPr>
-              <w:spacing w:after="0"/>
+              <w:spacing w:after="0" w:line="240" w:lineRule="auto"/>
             </w:pPr>
+            <w:r/>
             <w:r>
               <w:rPr>
+                <w:rFonts w:ascii="Aptos" w:hAnsi="Aptos"/>
                 <w:b/>
-                <w:sz w:val="17"/>
+                <w:i w:val="0"/>
+                <w:sz w:val="16"/>
               </w:rPr>
-              <w:t>Performance Engineering</w:t>
+              <w:t>Performance engineering</w:t>
             </w:r>
           </w:p>
         </w:tc>
         <w:tc>
           <w:tcPr>
-            <w:tcW w:type="dxa" w:w="8136"/>
+            <w:tcW w:type="dxa" w:w="8179"/>
+            <w:vAlign w:val="center"/>
             <w:tcBorders>
-              <w:top w:val="single" w:sz="4" w:space="0" w:color="D9D9D9"/>
-              <w:left w:val="single" w:sz="4" w:space="0" w:color="D9D9D9"/>
-              <w:bottom w:val="single" w:sz="4" w:space="0" w:color="D9D9D9"/>
-              <w:right w:val="single" w:sz="4" w:space="0" w:color="D9D9D9"/>
-              <w:insideH w:val="single" w:sz="4" w:space="0" w:color="D9D9D9"/>
-              <w:insideV w:val="single" w:sz="4" w:space="0" w:color="D9D9D9"/>
+              <w:top w:val="single" w:sz="4" w:color="D9D9D9"/>
+              <w:left w:val="single" w:sz="4" w:color="D9D9D9"/>
+              <w:bottom w:val="single" w:sz="4" w:color="D9D9D9"/>
+              <w:right w:val="single" w:sz="4" w:color="D9D9D9"/>
+              <w:insideH w:val="single" w:sz="4" w:color="D9D9D9"/>
+              <w:insideV w:val="single" w:sz="4" w:color="D9D9D9"/>
             </w:tcBorders>
             <w:tcMar>
-              <w:top w:w="70" w:type="dxa"/>
-              <w:start w:w="90" w:type="dxa"/>
-              <w:bottom w:w="70" w:type="dxa"/>
-              <w:end w:w="90" w:type="dxa"/>
+              <w:top w:w="65" w:type="dxa"/>
+              <w:start w:w="80" w:type="dxa"/>
+              <w:bottom w:w="65" w:type="dxa"/>
+              <w:end w:w="80" w:type="dxa"/>
             </w:tcMar>
+            <w:shd w:fill="F3F7FA"/>
           </w:tcPr>
           <w:p>
             <w:pPr>
-              <w:spacing w:after="0"/>
+              <w:spacing w:after="0" w:line="240" w:lineRule="auto"/>
             </w:pPr>
+            <w:r/>
             <w:r>
               <w:rPr>
-                <w:sz w:val="17"/>
+                <w:rFonts w:ascii="Aptos" w:hAnsi="Aptos"/>
+                <w:b w:val="0"/>
+                <w:i w:val="0"/>
+                <w:sz w:val="16"/>
               </w:rPr>
-              <w:t>T-SQL optimization, stored procedure tuning, indexing strategies, execution plan review, slow-query troubleshooting, bottleneck analysis</w:t>
+              <w:t>Advanced T-SQL, stored procedures, functions, indexing, execution-pattern analysis, long-running queries, set-based optimization and bottleneck troubleshooting</w:t>
             </w:r>
           </w:p>
         </w:tc>
@@ -264,62 +337,71 @@
       <w:tr>
         <w:tc>
           <w:tcPr>
-            <w:tcW w:type="dxa" w:w="2520"/>
+            <w:tcW w:type="dxa" w:w="2477"/>
+            <w:vAlign w:val="center"/>
             <w:tcBorders>
-              <w:top w:val="single" w:sz="4" w:space="0" w:color="D9D9D9"/>
-              <w:left w:val="single" w:sz="4" w:space="0" w:color="D9D9D9"/>
-              <w:bottom w:val="single" w:sz="4" w:space="0" w:color="D9D9D9"/>
-              <w:right w:val="single" w:sz="4" w:space="0" w:color="D9D9D9"/>
-              <w:insideH w:val="single" w:sz="4" w:space="0" w:color="D9D9D9"/>
-              <w:insideV w:val="single" w:sz="4" w:space="0" w:color="D9D9D9"/>
+              <w:top w:val="single" w:sz="4" w:color="D9D9D9"/>
+              <w:left w:val="single" w:sz="4" w:color="D9D9D9"/>
+              <w:bottom w:val="single" w:sz="4" w:color="D9D9D9"/>
+              <w:right w:val="single" w:sz="4" w:color="D9D9D9"/>
+              <w:insideH w:val="single" w:sz="4" w:color="D9D9D9"/>
+              <w:insideV w:val="single" w:sz="4" w:color="D9D9D9"/>
             </w:tcBorders>
             <w:tcMar>
-              <w:top w:w="70" w:type="dxa"/>
-              <w:start w:w="90" w:type="dxa"/>
-              <w:bottom w:w="70" w:type="dxa"/>
-              <w:end w:w="90" w:type="dxa"/>
+              <w:top w:w="65" w:type="dxa"/>
+              <w:start w:w="80" w:type="dxa"/>
+              <w:bottom w:w="65" w:type="dxa"/>
+              <w:end w:w="80" w:type="dxa"/>
             </w:tcMar>
           </w:tcPr>
           <w:p>
             <w:pPr>
-              <w:spacing w:after="0"/>
+              <w:spacing w:after="0" w:line="240" w:lineRule="auto"/>
             </w:pPr>
+            <w:r/>
             <w:r>
               <w:rPr>
+                <w:rFonts w:ascii="Aptos" w:hAnsi="Aptos"/>
                 <w:b/>
-                <w:sz w:val="17"/>
+                <w:i w:val="0"/>
+                <w:sz w:val="16"/>
               </w:rPr>
-              <w:t>Database Development</w:t>
+              <w:t>Security and standards</w:t>
             </w:r>
           </w:p>
         </w:tc>
         <w:tc>
           <w:tcPr>
-            <w:tcW w:type="dxa" w:w="8136"/>
+            <w:tcW w:type="dxa" w:w="8179"/>
+            <w:vAlign w:val="center"/>
             <w:tcBorders>
-              <w:top w:val="single" w:sz="4" w:space="0" w:color="D9D9D9"/>
-              <w:left w:val="single" w:sz="4" w:space="0" w:color="D9D9D9"/>
-              <w:bottom w:val="single" w:sz="4" w:space="0" w:color="D9D9D9"/>
-              <w:right w:val="single" w:sz="4" w:space="0" w:color="D9D9D9"/>
-              <w:insideH w:val="single" w:sz="4" w:space="0" w:color="D9D9D9"/>
-              <w:insideV w:val="single" w:sz="4" w:space="0" w:color="D9D9D9"/>
+              <w:top w:val="single" w:sz="4" w:color="D9D9D9"/>
+              <w:left w:val="single" w:sz="4" w:color="D9D9D9"/>
+              <w:bottom w:val="single" w:sz="4" w:color="D9D9D9"/>
+              <w:right w:val="single" w:sz="4" w:color="D9D9D9"/>
+              <w:insideH w:val="single" w:sz="4" w:color="D9D9D9"/>
+              <w:insideV w:val="single" w:sz="4" w:color="D9D9D9"/>
             </w:tcBorders>
             <w:tcMar>
-              <w:top w:w="70" w:type="dxa"/>
-              <w:start w:w="90" w:type="dxa"/>
-              <w:bottom w:w="70" w:type="dxa"/>
-              <w:end w:w="90" w:type="dxa"/>
+              <w:top w:w="65" w:type="dxa"/>
+              <w:start w:w="80" w:type="dxa"/>
+              <w:bottom w:w="65" w:type="dxa"/>
+              <w:end w:w="80" w:type="dxa"/>
             </w:tcMar>
           </w:tcPr>
           <w:p>
             <w:pPr>
-              <w:spacing w:after="0"/>
+              <w:spacing w:after="0" w:line="240" w:lineRule="auto"/>
             </w:pPr>
+            <w:r/>
             <w:r>
               <w:rPr>
-                <w:sz w:val="17"/>
+                <w:rFonts w:ascii="Aptos" w:hAnsi="Aptos"/>
+                <w:b w:val="0"/>
+                <w:i w:val="0"/>
+                <w:sz w:val="16"/>
               </w:rPr>
-              <w:t>Stored procedures, functions, views, schema design, relational modeling, data validation, data integrity, SQL-based business logic</w:t>
+              <w:t>RBAC, least privilege, JIT privileged access, login and user auditing, schema permissions, SID mapping, credential rotation, runbooks and operational procedures</w:t>
             </w:r>
           </w:p>
         </w:tc>
@@ -327,62 +409,73 @@
       <w:tr>
         <w:tc>
           <w:tcPr>
-            <w:tcW w:type="dxa" w:w="2520"/>
+            <w:tcW w:type="dxa" w:w="2477"/>
+            <w:vAlign w:val="center"/>
             <w:tcBorders>
-              <w:top w:val="single" w:sz="4" w:space="0" w:color="D9D9D9"/>
-              <w:left w:val="single" w:sz="4" w:space="0" w:color="D9D9D9"/>
-              <w:bottom w:val="single" w:sz="4" w:space="0" w:color="D9D9D9"/>
-              <w:right w:val="single" w:sz="4" w:space="0" w:color="D9D9D9"/>
-              <w:insideH w:val="single" w:sz="4" w:space="0" w:color="D9D9D9"/>
-              <w:insideV w:val="single" w:sz="4" w:space="0" w:color="D9D9D9"/>
+              <w:top w:val="single" w:sz="4" w:color="D9D9D9"/>
+              <w:left w:val="single" w:sz="4" w:color="D9D9D9"/>
+              <w:bottom w:val="single" w:sz="4" w:color="D9D9D9"/>
+              <w:right w:val="single" w:sz="4" w:color="D9D9D9"/>
+              <w:insideH w:val="single" w:sz="4" w:color="D9D9D9"/>
+              <w:insideV w:val="single" w:sz="4" w:color="D9D9D9"/>
             </w:tcBorders>
             <w:tcMar>
-              <w:top w:w="70" w:type="dxa"/>
-              <w:start w:w="90" w:type="dxa"/>
-              <w:bottom w:w="70" w:type="dxa"/>
-              <w:end w:w="90" w:type="dxa"/>
+              <w:top w:w="65" w:type="dxa"/>
+              <w:start w:w="80" w:type="dxa"/>
+              <w:bottom w:w="65" w:type="dxa"/>
+              <w:end w:w="80" w:type="dxa"/>
             </w:tcMar>
+            <w:shd w:fill="F3F7FA"/>
           </w:tcPr>
           <w:p>
             <w:pPr>
-              <w:spacing w:after="0"/>
+              <w:spacing w:after="0" w:line="240" w:lineRule="auto"/>
             </w:pPr>
+            <w:r/>
             <w:r>
               <w:rPr>
+                <w:rFonts w:ascii="Aptos" w:hAnsi="Aptos"/>
                 <w:b/>
-                <w:sz w:val="17"/>
+                <w:i w:val="0"/>
+                <w:sz w:val="16"/>
               </w:rPr>
-              <w:t>Data Engineering and BI</w:t>
+              <w:t>Platforms and integration</w:t>
             </w:r>
           </w:p>
         </w:tc>
         <w:tc>
           <w:tcPr>
-            <w:tcW w:type="dxa" w:w="8136"/>
+            <w:tcW w:type="dxa" w:w="8179"/>
+            <w:vAlign w:val="center"/>
             <w:tcBorders>
-              <w:top w:val="single" w:sz="4" w:space="0" w:color="D9D9D9"/>
-              <w:left w:val="single" w:sz="4" w:space="0" w:color="D9D9D9"/>
-              <w:bottom w:val="single" w:sz="4" w:space="0" w:color="D9D9D9"/>
-              <w:right w:val="single" w:sz="4" w:space="0" w:color="D9D9D9"/>
-              <w:insideH w:val="single" w:sz="4" w:space="0" w:color="D9D9D9"/>
-              <w:insideV w:val="single" w:sz="4" w:space="0" w:color="D9D9D9"/>
+              <w:top w:val="single" w:sz="4" w:color="D9D9D9"/>
+              <w:left w:val="single" w:sz="4" w:color="D9D9D9"/>
+              <w:bottom w:val="single" w:sz="4" w:color="D9D9D9"/>
+              <w:right w:val="single" w:sz="4" w:color="D9D9D9"/>
+              <w:insideH w:val="single" w:sz="4" w:color="D9D9D9"/>
+              <w:insideV w:val="single" w:sz="4" w:color="D9D9D9"/>
             </w:tcBorders>
             <w:tcMar>
-              <w:top w:w="70" w:type="dxa"/>
-              <w:start w:w="90" w:type="dxa"/>
-              <w:bottom w:w="70" w:type="dxa"/>
-              <w:end w:w="90" w:type="dxa"/>
+              <w:top w:w="65" w:type="dxa"/>
+              <w:start w:w="80" w:type="dxa"/>
+              <w:bottom w:w="65" w:type="dxa"/>
+              <w:end w:w="80" w:type="dxa"/>
             </w:tcMar>
+            <w:shd w:fill="F3F7FA"/>
           </w:tcPr>
           <w:p>
             <w:pPr>
-              <w:spacing w:after="0"/>
+              <w:spacing w:after="0" w:line="240" w:lineRule="auto"/>
             </w:pPr>
+            <w:r/>
             <w:r>
               <w:rPr>
-                <w:sz w:val="17"/>
+                <w:rFonts w:ascii="Aptos" w:hAnsi="Aptos"/>
+                <w:b w:val="0"/>
+                <w:i w:val="0"/>
+                <w:sz w:val="16"/>
               </w:rPr>
-              <w:t>SSIS, SSAS, SSRS, ETL/ELT pipelines, data warehousing, Power BI, Snowflake SQL, dbt, PostgreSQL, MySQL</w:t>
+              <w:t>SQL Server, AWS RDS, SSIS, MySQL, PostgreSQL, Snowflake, Azure-based environments, ETL/ELT, data warehousing and Power BI</w:t>
             </w:r>
           </w:p>
         </w:tc>
@@ -390,62 +483,71 @@
       <w:tr>
         <w:tc>
           <w:tcPr>
-            <w:tcW w:type="dxa" w:w="2520"/>
+            <w:tcW w:type="dxa" w:w="2477"/>
+            <w:vAlign w:val="center"/>
             <w:tcBorders>
-              <w:top w:val="single" w:sz="4" w:space="0" w:color="D9D9D9"/>
-              <w:left w:val="single" w:sz="4" w:space="0" w:color="D9D9D9"/>
-              <w:bottom w:val="single" w:sz="4" w:space="0" w:color="D9D9D9"/>
-              <w:right w:val="single" w:sz="4" w:space="0" w:color="D9D9D9"/>
-              <w:insideH w:val="single" w:sz="4" w:space="0" w:color="D9D9D9"/>
-              <w:insideV w:val="single" w:sz="4" w:space="0" w:color="D9D9D9"/>
+              <w:top w:val="single" w:sz="4" w:color="D9D9D9"/>
+              <w:left w:val="single" w:sz="4" w:color="D9D9D9"/>
+              <w:bottom w:val="single" w:sz="4" w:color="D9D9D9"/>
+              <w:right w:val="single" w:sz="4" w:color="D9D9D9"/>
+              <w:insideH w:val="single" w:sz="4" w:color="D9D9D9"/>
+              <w:insideV w:val="single" w:sz="4" w:color="D9D9D9"/>
             </w:tcBorders>
             <w:tcMar>
-              <w:top w:w="70" w:type="dxa"/>
-              <w:start w:w="90" w:type="dxa"/>
-              <w:bottom w:w="70" w:type="dxa"/>
-              <w:end w:w="90" w:type="dxa"/>
+              <w:top w:w="65" w:type="dxa"/>
+              <w:start w:w="80" w:type="dxa"/>
+              <w:bottom w:w="65" w:type="dxa"/>
+              <w:end w:w="80" w:type="dxa"/>
             </w:tcMar>
           </w:tcPr>
           <w:p>
             <w:pPr>
-              <w:spacing w:after="0"/>
+              <w:spacing w:after="0" w:line="240" w:lineRule="auto"/>
             </w:pPr>
+            <w:r/>
             <w:r>
               <w:rPr>
+                <w:rFonts w:ascii="Aptos" w:hAnsi="Aptos"/>
                 <w:b/>
-                <w:sz w:val="17"/>
+                <w:i w:val="0"/>
+                <w:sz w:val="16"/>
               </w:rPr>
-              <w:t>Automation and Delivery</w:t>
+              <w:t>Automation and delivery</w:t>
             </w:r>
           </w:p>
         </w:tc>
         <w:tc>
           <w:tcPr>
-            <w:tcW w:type="dxa" w:w="8136"/>
+            <w:tcW w:type="dxa" w:w="8179"/>
+            <w:vAlign w:val="center"/>
             <w:tcBorders>
-              <w:top w:val="single" w:sz="4" w:space="0" w:color="D9D9D9"/>
-              <w:left w:val="single" w:sz="4" w:space="0" w:color="D9D9D9"/>
-              <w:bottom w:val="single" w:sz="4" w:space="0" w:color="D9D9D9"/>
-              <w:right w:val="single" w:sz="4" w:space="0" w:color="D9D9D9"/>
-              <w:insideH w:val="single" w:sz="4" w:space="0" w:color="D9D9D9"/>
-              <w:insideV w:val="single" w:sz="4" w:space="0" w:color="D9D9D9"/>
+              <w:top w:val="single" w:sz="4" w:color="D9D9D9"/>
+              <w:left w:val="single" w:sz="4" w:color="D9D9D9"/>
+              <w:bottom w:val="single" w:sz="4" w:color="D9D9D9"/>
+              <w:right w:val="single" w:sz="4" w:color="D9D9D9"/>
+              <w:insideH w:val="single" w:sz="4" w:color="D9D9D9"/>
+              <w:insideV w:val="single" w:sz="4" w:color="D9D9D9"/>
             </w:tcBorders>
             <w:tcMar>
-              <w:top w:w="70" w:type="dxa"/>
-              <w:start w:w="90" w:type="dxa"/>
-              <w:bottom w:w="70" w:type="dxa"/>
-              <w:end w:w="90" w:type="dxa"/>
+              <w:top w:w="65" w:type="dxa"/>
+              <w:start w:w="80" w:type="dxa"/>
+              <w:bottom w:w="65" w:type="dxa"/>
+              <w:end w:w="80" w:type="dxa"/>
             </w:tcMar>
           </w:tcPr>
           <w:p>
             <w:pPr>
-              <w:spacing w:after="0"/>
+              <w:spacing w:after="0" w:line="240" w:lineRule="auto"/>
             </w:pPr>
+            <w:r/>
             <w:r>
               <w:rPr>
-                <w:sz w:val="17"/>
+                <w:rFonts w:ascii="Aptos" w:hAnsi="Aptos"/>
+                <w:b w:val="0"/>
+                <w:i w:val="0"/>
+                <w:sz w:val="16"/>
               </w:rPr>
-              <w:t>Python, PowerShell, Git exposure, Agile/Scrum collaboration, documentation, Cursor, AI-assisted PR review bots</w:t>
+              <w:t>PowerShell, Python, Git, controlled deployment and rollback scripts, diagnostic utilities, Agile collaboration, Cursor and AI-assisted pull-request review</w:t>
             </w:r>
           </w:p>
         </w:tc>
@@ -453,589 +555,873 @@
     </w:tbl>
     <w:p>
       <w:pPr>
-        <w:pStyle w:val="Heading1"/>
-        <w:spacing w:before="160" w:after="60"/>
+        <w:keepNext/>
+        <w:spacing w:before="140" w:after="60"/>
+        <w:pBdr>
+          <w:bottom w:val="single" w:sz="4" w:space="2" w:color="BDD7EE"/>
+        </w:pBdr>
       </w:pPr>
       <w:r>
+        <w:rPr>
+          <w:rFonts w:ascii="Aptos Display" w:hAnsi="Aptos Display"/>
+          <w:b/>
+          <w:i w:val="0"/>
+          <w:color w:val="1F4E79"/>
+          <w:sz w:val="20"/>
+        </w:rPr>
         <w:t>PROFESSIONAL EXPERIENCE</w:t>
       </w:r>
     </w:p>
     <w:p>
       <w:pPr>
-        <w:spacing w:before="80" w:after="0"/>
+        <w:keepNext/>
+        <w:pageBreakBefore w:val="0"/>
+        <w:spacing w:before="90" w:after="10"/>
       </w:pPr>
       <w:r>
         <w:rPr>
+          <w:rFonts w:ascii="Aptos" w:hAnsi="Aptos"/>
           <w:b/>
           <w:i w:val="0"/>
+          <w:color w:val="222222"/>
+          <w:sz w:val="20"/>
         </w:rPr>
-        <w:t>Snowflake Developer / Data Engineer | ServiceTitan</w:t>
+        <w:t>SQL Server DBA / Database Engineer | MWR Life</w:t>
       </w:r>
+    </w:p>
+    <w:p>
+      <w:pPr>
+        <w:keepNext/>
+        <w:spacing w:after="30"/>
+      </w:pPr>
       <w:r>
         <w:rPr>
+          <w:rFonts w:ascii="Aptos" w:hAnsi="Aptos"/>
           <w:b w:val="0"/>
           <w:i/>
-          <w:sz w:val="18"/>
+          <w:color w:val="5B5B5B"/>
+          <w:sz w:val="17"/>
         </w:rPr>
-        <w:br/>
         <w:t>September 2024 - Present | Remote / Costa Rica</w:t>
       </w:r>
     </w:p>
     <w:p>
       <w:pPr>
         <w:pStyle w:val="ListBullet"/>
-        <w:spacing w:after="30" w:line="245" w:lineRule="auto"/>
+        <w:keepLines/>
+        <w:spacing w:after="20" w:line="242" w:lineRule="auto"/>
+        <w:ind w:left="259" w:hanging="173"/>
       </w:pPr>
       <w:r>
-        <w:t>Migrated C# reporting logic into Snowflake SQL, improving maintainability of reporting logic and supporting scalable analytics workflows.</w:t>
+        <w:rPr>
+          <w:rFonts w:ascii="Aptos" w:hAnsi="Aptos"/>
+          <w:b w:val="0"/>
+          <w:i w:val="0"/>
+          <w:sz w:val="18"/>
+        </w:rPr>
+        <w:t>Administer and support SQL Server databases hosted on AWS RDS across Production, Development, and Staging, covering access, connectivity, backup and restore, maintenance, monitoring, and production incident response.</w:t>
       </w:r>
     </w:p>
     <w:p>
       <w:pPr>
         <w:pStyle w:val="ListBullet"/>
-        <w:spacing w:after="30" w:line="245" w:lineRule="auto"/>
+        <w:keepLines/>
+        <w:spacing w:after="20" w:line="242" w:lineRule="auto"/>
+        <w:ind w:left="259" w:hanging="173"/>
       </w:pPr>
       <w:r>
-        <w:t>Create and maintain dbt models in silver and gold layers, improving model organization, reuse, and downstream reporting reliability.</w:t>
+        <w:rPr>
+          <w:rFonts w:ascii="Aptos" w:hAnsi="Aptos"/>
+          <w:b w:val="0"/>
+          <w:i w:val="0"/>
+          <w:sz w:val="18"/>
+        </w:rPr>
+        <w:t>Designed a role-based access model using least-privilege principles, standardized account conventions, JIT privileged access, permission audits, and controlled post-restore procedures for lower environments.</w:t>
       </w:r>
     </w:p>
     <w:p>
       <w:pPr>
         <w:pStyle w:val="ListBullet"/>
-        <w:spacing w:after="30" w:line="245" w:lineRule="auto"/>
+        <w:keepLines/>
+        <w:spacing w:after="20" w:line="242" w:lineRule="auto"/>
+        <w:ind w:left="259" w:hanging="173"/>
       </w:pPr>
       <w:r>
-        <w:t>Optimized Snowflake SQL and dbt workloads, reducing data warehouse processing time by 20% during an initial performance improvement phase.</w:t>
+        <w:rPr>
+          <w:rFonts w:ascii="Aptos" w:hAnsi="Aptos"/>
+          <w:b w:val="0"/>
+          <w:i w:val="0"/>
+          <w:sz w:val="18"/>
+        </w:rPr>
+        <w:t>Develop T-SQL stored procedures, functions, deployment and rollback scripts, diagnostic procedures, and support utilities while resolving authentication, SID mapping, SSL, firewall, and application connectivity issues.</w:t>
       </w:r>
     </w:p>
     <w:p>
       <w:pPr>
         <w:pStyle w:val="ListBullet"/>
-        <w:spacing w:after="30" w:line="245" w:lineRule="auto"/>
+        <w:keepLines/>
+        <w:spacing w:after="20" w:line="242" w:lineRule="auto"/>
+        <w:ind w:left="259" w:hanging="173"/>
       </w:pPr>
       <w:r>
-        <w:t>Created a Kimball-based data warehouse model proof of concept to improve modeling standards, query behavior, and processing performance.</w:t>
+        <w:rPr>
+          <w:rFonts w:ascii="Aptos" w:hAnsi="Aptos"/>
+          <w:b w:val="0"/>
+          <w:i w:val="0"/>
+          <w:sz w:val="18"/>
+        </w:rPr>
+        <w:t>Led a controlled production data recovery and integration remediation effort, validating source backups, recovering hundreds of records, correcting stored procedures, and completing post-deployment verification.</w:t>
       </w:r>
     </w:p>
     <w:p>
       <w:pPr>
         <w:pStyle w:val="ListBullet"/>
-        <w:spacing w:after="30" w:line="245" w:lineRule="auto"/>
+        <w:keepLines/>
+        <w:spacing w:after="20" w:line="242" w:lineRule="auto"/>
+        <w:ind w:left="259" w:hanging="173"/>
       </w:pPr>
       <w:r>
-        <w:t>Support MetricFlow semantic layer development and Snowflake Cortex use cases for AI-enabled analytics, metric consistency, and data documentation.</w:t>
+        <w:rPr>
+          <w:rFonts w:ascii="Aptos" w:hAnsi="Aptos"/>
+          <w:b w:val="0"/>
+          <w:i w:val="0"/>
+          <w:sz w:val="18"/>
+        </w:rPr>
+        <w:t>Analyze long-running queries, indexes, execution patterns, query variants, and cursor-based processes; design set-based alternatives and validate output equivalence before release.</w:t>
       </w:r>
     </w:p>
     <w:p>
       <w:pPr>
-        <w:spacing w:after="40"/>
+        <w:pStyle w:val="ListBullet"/>
+        <w:keepLines/>
+        <w:spacing w:after="20" w:line="242" w:lineRule="auto"/>
+        <w:ind w:left="259" w:hanging="173"/>
       </w:pPr>
       <w:r>
         <w:rPr>
+          <w:rFonts w:ascii="Aptos" w:hAnsi="Aptos"/>
+          <w:b w:val="0"/>
+          <w:i w:val="0"/>
+          <w:sz w:val="18"/>
+        </w:rPr>
+        <w:t>Built monitoring dashboards and runbooks for SQL Agent jobs, alerts, execution history, integrations, data-quality exceptions, restore procedures, access controls, and incident response.</w:t>
+      </w:r>
+    </w:p>
+    <w:p>
+      <w:pPr>
+        <w:keepLines/>
+        <w:spacing w:after="30"/>
+      </w:pPr>
+      <w:r>
+        <w:rPr>
+          <w:rFonts w:ascii="Aptos" w:hAnsi="Aptos"/>
           <w:b/>
           <w:i w:val="0"/>
-          <w:sz w:val="18"/>
+          <w:color w:val="222222"/>
+          <w:sz w:val="17"/>
         </w:rPr>
         <w:t xml:space="preserve">Technologies: </w:t>
       </w:r>
       <w:r>
         <w:rPr>
+          <w:rFonts w:ascii="Aptos" w:hAnsi="Aptos"/>
           <w:b w:val="0"/>
           <w:i w:val="0"/>
-          <w:sz w:val="18"/>
+          <w:color w:val="5B5B5B"/>
+          <w:sz w:val="17"/>
         </w:rPr>
-        <w:t>Snowflake, Snowflake SQL, Snowflake Cortex, dbt, MetricFlow, Kimball, SQL, C# logic migration, Cursor, AI-assisted PR review bot</w:t>
+        <w:t>SQL Server, AWS RDS, T-SQL, SSMS, DBeaver, SQL Agent, Database Mail, PowerShell, JSON/OpenJSON, Git, RBAC, JIT access, backup/restore, monitoring and performance tuning</w:t>
       </w:r>
     </w:p>
     <w:p>
       <w:pPr>
-        <w:spacing w:before="80" w:after="0"/>
+        <w:keepNext/>
+        <w:pageBreakBefore/>
+        <w:spacing w:before="90" w:after="10"/>
       </w:pPr>
       <w:r>
         <w:rPr>
+          <w:rFonts w:ascii="Aptos" w:hAnsi="Aptos"/>
           <w:b/>
           <w:i w:val="0"/>
+          <w:color w:val="222222"/>
+          <w:sz w:val="20"/>
         </w:rPr>
-        <w:t>Data Engineer | SMASH Costa Rica</w:t>
+        <w:t>DBA / SQL Developer | Health Catalyst</w:t>
       </w:r>
+    </w:p>
+    <w:p>
+      <w:pPr>
+        <w:keepNext/>
+        <w:spacing w:after="30"/>
+      </w:pPr>
       <w:r>
         <w:rPr>
+          <w:rFonts w:ascii="Aptos" w:hAnsi="Aptos"/>
           <w:b w:val="0"/>
           <w:i/>
-          <w:sz w:val="18"/>
+          <w:color w:val="5B5B5B"/>
+          <w:sz w:val="17"/>
         </w:rPr>
-        <w:br/>
         <w:t>May 2021 - September 2024 | San Jose, Costa Rica</w:t>
       </w:r>
     </w:p>
     <w:p>
       <w:pPr>
         <w:pStyle w:val="ListBullet"/>
-        <w:spacing w:after="30" w:line="245" w:lineRule="auto"/>
+        <w:keepLines/>
+        <w:spacing w:after="20" w:line="242" w:lineRule="auto"/>
+        <w:ind w:left="259" w:hanging="173"/>
       </w:pPr>
       <w:r>
-        <w:t>Designed and implemented ETL applications tailored to client requirements, reducing manual data processing time by up to 40%.</w:t>
+        <w:rPr>
+          <w:rFonts w:ascii="Aptos" w:hAnsi="Aptos"/>
+          <w:b w:val="0"/>
+          <w:i w:val="0"/>
+          <w:sz w:val="18"/>
+        </w:rPr>
+        <w:t>Developed and supported SQL Server, SSIS, Snowflake, Python, and PowerShell data workflows for production and client-facing requirements.</w:t>
       </w:r>
     </w:p>
     <w:p>
       <w:pPr>
         <w:pStyle w:val="ListBullet"/>
-        <w:spacing w:after="30" w:line="245" w:lineRule="auto"/>
+        <w:keepLines/>
+        <w:spacing w:after="20" w:line="242" w:lineRule="auto"/>
+        <w:ind w:left="259" w:hanging="173"/>
       </w:pPr>
       <w:r>
-        <w:t>Built and maintained production data workflows using SQL Server, SSIS, Python, PowerShell, Snowflake, Power BI, and Excel.</w:t>
+        <w:rPr>
+          <w:rFonts w:ascii="Aptos" w:hAnsi="Aptos"/>
+          <w:b w:val="0"/>
+          <w:i w:val="0"/>
+          <w:sz w:val="18"/>
+        </w:rPr>
+        <w:t>Designed customized ETL applications that reduced manual processing time by up to 40%.</w:t>
       </w:r>
     </w:p>
     <w:p>
       <w:pPr>
         <w:pStyle w:val="ListBullet"/>
-        <w:spacing w:after="30" w:line="245" w:lineRule="auto"/>
+        <w:keepLines/>
+        <w:spacing w:after="20" w:line="242" w:lineRule="auto"/>
+        <w:ind w:left="259" w:hanging="173"/>
       </w:pPr>
       <w:r>
-        <w:t>Developed automated exploratory analysis and validation tools with Pandas, NumPy, and Matplotlib to detect anomalies and improve validation accuracy by 30%.</w:t>
+        <w:rPr>
+          <w:rFonts w:ascii="Aptos" w:hAnsi="Aptos"/>
+          <w:b w:val="0"/>
+          <w:i w:val="0"/>
+          <w:sz w:val="18"/>
+        </w:rPr>
+        <w:t>Automated validation and anomaly-detection routines, improving data-validation accuracy by 30% and supporting reliable reporting operations.</w:t>
       </w:r>
     </w:p>
     <w:p>
       <w:pPr>
-        <w:pStyle w:val="ListBullet"/>
-        <w:spacing w:after="30" w:line="245" w:lineRule="auto"/>
-      </w:pPr>
-      <w:r>
-        <w:t>Prepared, cleaned, transformed, and modeled datasets for business reporting, dashboards, and operational decision-making.</w:t>
-      </w:r>
-    </w:p>
-    <w:p>
-      <w:pPr>
-        <w:spacing w:after="40"/>
+        <w:keepLines/>
+        <w:spacing w:after="30"/>
       </w:pPr>
       <w:r>
         <w:rPr>
+          <w:rFonts w:ascii="Aptos" w:hAnsi="Aptos"/>
           <w:b/>
           <w:i w:val="0"/>
-          <w:sz w:val="18"/>
+          <w:color w:val="222222"/>
+          <w:sz w:val="17"/>
         </w:rPr>
         <w:t xml:space="preserve">Technologies: </w:t>
       </w:r>
       <w:r>
         <w:rPr>
+          <w:rFonts w:ascii="Aptos" w:hAnsi="Aptos"/>
           <w:b w:val="0"/>
           <w:i w:val="0"/>
-          <w:sz w:val="18"/>
+          <w:color w:val="5B5B5B"/>
+          <w:sz w:val="17"/>
         </w:rPr>
-        <w:t>SQL Server, SSIS, Power BI, Python, Pandas, NumPy, Matplotlib, PowerShell, Snowflake, Excel</w:t>
+        <w:t>SQL Server, T-SQL, SSIS, Snowflake, Python, PowerShell, Power BI, Pandas and Excel</w:t>
       </w:r>
     </w:p>
     <w:p>
       <w:pPr>
-        <w:spacing w:before="80" w:after="0"/>
+        <w:keepNext/>
+        <w:pageBreakBefore w:val="0"/>
+        <w:spacing w:before="90" w:after="10"/>
       </w:pPr>
       <w:r>
         <w:rPr>
+          <w:rFonts w:ascii="Aptos" w:hAnsi="Aptos"/>
           <w:b/>
           <w:i w:val="0"/>
+          <w:color w:val="222222"/>
+          <w:sz w:val="20"/>
         </w:rPr>
         <w:t>SQL Developer | Intertec International</w:t>
       </w:r>
+    </w:p>
+    <w:p>
+      <w:pPr>
+        <w:keepNext/>
+        <w:spacing w:after="30"/>
+      </w:pPr>
       <w:r>
         <w:rPr>
+          <w:rFonts w:ascii="Aptos" w:hAnsi="Aptos"/>
           <w:b w:val="0"/>
           <w:i/>
-          <w:sz w:val="18"/>
+          <w:color w:val="5B5B5B"/>
+          <w:sz w:val="17"/>
         </w:rPr>
-        <w:br/>
         <w:t>February 2019 - April 2021 | San Jose, Costa Rica</w:t>
       </w:r>
     </w:p>
     <w:p>
       <w:pPr>
         <w:pStyle w:val="ListBullet"/>
-        <w:spacing w:after="30" w:line="245" w:lineRule="auto"/>
+        <w:keepLines/>
+        <w:spacing w:after="20" w:line="242" w:lineRule="auto"/>
+        <w:ind w:left="259" w:hanging="173"/>
       </w:pPr>
       <w:r>
-        <w:t>Developed and optimized stored procedures, complex SQL queries, and database workflows supporting business logic and analytics workloads.</w:t>
+        <w:rPr>
+          <w:rFonts w:ascii="Aptos" w:hAnsi="Aptos"/>
+          <w:b w:val="0"/>
+          <w:i w:val="0"/>
+          <w:sz w:val="18"/>
+        </w:rPr>
+        <w:t>Developed and optimized advanced T-SQL queries, stored procedures, and database workflows supporting production business logic and analytics.</w:t>
       </w:r>
     </w:p>
     <w:p>
       <w:pPr>
         <w:pStyle w:val="ListBullet"/>
-        <w:spacing w:after="30" w:line="245" w:lineRule="auto"/>
+        <w:keepLines/>
+        <w:spacing w:after="20" w:line="242" w:lineRule="auto"/>
+        <w:ind w:left="259" w:hanging="173"/>
       </w:pPr>
       <w:r>
-        <w:t>Reduced query execution times by up to 50% through T-SQL tuning, indexing strategies, and database performance optimization.</w:t>
+        <w:rPr>
+          <w:rFonts w:ascii="Aptos" w:hAnsi="Aptos"/>
+          <w:b w:val="0"/>
+          <w:i w:val="0"/>
+          <w:sz w:val="18"/>
+        </w:rPr>
+        <w:t>Reduced query execution times by up to 50% through SQL tuning, indexing strategies, and performance analysis.</w:t>
       </w:r>
     </w:p>
     <w:p>
       <w:pPr>
         <w:pStyle w:val="ListBullet"/>
-        <w:spacing w:after="30" w:line="245" w:lineRule="auto"/>
+        <w:keepLines/>
+        <w:spacing w:after="20" w:line="242" w:lineRule="auto"/>
+        <w:ind w:left="259" w:hanging="173"/>
       </w:pPr>
       <w:r>
-        <w:t>Consolidated disparate data sources into analytics-ready datasets using optimized ETL processes.</w:t>
+        <w:rPr>
+          <w:rFonts w:ascii="Aptos" w:hAnsi="Aptos"/>
+          <w:b w:val="0"/>
+          <w:i w:val="0"/>
+          <w:sz w:val="18"/>
+        </w:rPr>
+        <w:t>Integrated SQL Server, Salesforce, and MySQL data while improving data accuracy by more than 25% through validation and error handling.</w:t>
       </w:r>
     </w:p>
     <w:p>
       <w:pPr>
-        <w:pStyle w:val="ListBullet"/>
-        <w:spacing w:after="30" w:line="245" w:lineRule="auto"/>
-      </w:pPr>
-      <w:r>
-        <w:t>Improved data accuracy by more than 25% through validation checks and error-handling mechanisms across key workflows.</w:t>
-      </w:r>
-    </w:p>
-    <w:p>
-      <w:pPr>
-        <w:spacing w:after="40"/>
+        <w:keepLines/>
+        <w:spacing w:after="30"/>
       </w:pPr>
       <w:r>
         <w:rPr>
+          <w:rFonts w:ascii="Aptos" w:hAnsi="Aptos"/>
           <w:b/>
           <w:i w:val="0"/>
-          <w:sz w:val="18"/>
+          <w:color w:val="222222"/>
+          <w:sz w:val="17"/>
         </w:rPr>
         <w:t xml:space="preserve">Technologies: </w:t>
       </w:r>
       <w:r>
         <w:rPr>
+          <w:rFonts w:ascii="Aptos" w:hAnsi="Aptos"/>
           <w:b w:val="0"/>
           <w:i w:val="0"/>
-          <w:sz w:val="18"/>
+          <w:color w:val="5B5B5B"/>
+          <w:sz w:val="17"/>
         </w:rPr>
-        <w:t>SQL Server, T-SQL, SSIS, Salesforce, MySQL</w:t>
-      </w:r>
-    </w:p>
-    <w:p>
-      <w:r>
-        <w:br w:type="page"/>
+        <w:t>SQL Server, T-SQL, SSIS, Salesforce and MySQL</w:t>
       </w:r>
     </w:p>
     <w:p>
       <w:pPr>
-        <w:spacing w:before="80" w:after="0"/>
+        <w:keepNext/>
+        <w:pageBreakBefore w:val="0"/>
+        <w:spacing w:before="90" w:after="10"/>
       </w:pPr>
       <w:r>
         <w:rPr>
+          <w:rFonts w:ascii="Aptos" w:hAnsi="Aptos"/>
           <w:b/>
           <w:i w:val="0"/>
+          <w:color w:val="222222"/>
+          <w:sz w:val="20"/>
         </w:rPr>
         <w:t>DBA / SQL Developer | EL Tiempo</w:t>
       </w:r>
+    </w:p>
+    <w:p>
+      <w:pPr>
+        <w:keepNext/>
+        <w:spacing w:after="30"/>
+      </w:pPr>
       <w:r>
         <w:rPr>
+          <w:rFonts w:ascii="Aptos" w:hAnsi="Aptos"/>
           <w:b w:val="0"/>
           <w:i/>
-          <w:sz w:val="18"/>
+          <w:color w:val="5B5B5B"/>
+          <w:sz w:val="17"/>
         </w:rPr>
-        <w:br/>
         <w:t>September 2020 - November 2020 | Colombia</w:t>
       </w:r>
     </w:p>
     <w:p>
       <w:pPr>
         <w:pStyle w:val="ListBullet"/>
-        <w:spacing w:after="30" w:line="245" w:lineRule="auto"/>
+        <w:keepLines/>
+        <w:spacing w:after="20" w:line="242" w:lineRule="auto"/>
+        <w:ind w:left="259" w:hanging="173"/>
       </w:pPr>
       <w:r>
-        <w:t>Led planning and execution of migration activities for 10 SQL Server databases, coordinating validation, deployment timing, and continuity of operations.</w:t>
+        <w:rPr>
+          <w:rFonts w:ascii="Aptos" w:hAnsi="Aptos"/>
+          <w:b w:val="0"/>
+          <w:i w:val="0"/>
+          <w:sz w:val="18"/>
+        </w:rPr>
+        <w:t>Led planning and execution of migration activities for ten SQL Server databases, delivering all phases on time and within scope.</w:t>
       </w:r>
     </w:p>
     <w:p>
       <w:pPr>
         <w:pStyle w:val="ListBullet"/>
-        <w:spacing w:after="30" w:line="245" w:lineRule="auto"/>
+        <w:keepLines/>
+        <w:spacing w:after="20" w:line="242" w:lineRule="auto"/>
+        <w:ind w:left="259" w:hanging="173"/>
       </w:pPr>
       <w:r>
-        <w:t>Worked with cross-functional teams to identify risks, validate migrated data, and preserve database integrity during production changes.</w:t>
+        <w:rPr>
+          <w:rFonts w:ascii="Aptos" w:hAnsi="Aptos"/>
+          <w:b w:val="0"/>
+          <w:i w:val="0"/>
+          <w:sz w:val="18"/>
+        </w:rPr>
+        <w:t>Coordinated migration risk analysis, data validation, integrity controls, deployment timing, and operational continuity with cross-functional teams.</w:t>
       </w:r>
     </w:p>
     <w:p>
       <w:pPr>
-        <w:pStyle w:val="ListBullet"/>
-        <w:spacing w:after="30" w:line="245" w:lineRule="auto"/>
-      </w:pPr>
-      <w:r>
-        <w:t>Supported SQL Server and Azure-based database/reporting environments with SSIS and SSRS components.</w:t>
-      </w:r>
-    </w:p>
-    <w:p>
-      <w:pPr>
-        <w:spacing w:after="40"/>
+        <w:keepLines/>
+        <w:spacing w:after="30"/>
       </w:pPr>
       <w:r>
         <w:rPr>
+          <w:rFonts w:ascii="Aptos" w:hAnsi="Aptos"/>
           <w:b/>
           <w:i w:val="0"/>
-          <w:sz w:val="18"/>
+          <w:color w:val="222222"/>
+          <w:sz w:val="17"/>
         </w:rPr>
         <w:t xml:space="preserve">Technologies: </w:t>
       </w:r>
       <w:r>
         <w:rPr>
+          <w:rFonts w:ascii="Aptos" w:hAnsi="Aptos"/>
           <w:b w:val="0"/>
           <w:i w:val="0"/>
-          <w:sz w:val="18"/>
+          <w:color w:val="5B5B5B"/>
+          <w:sz w:val="17"/>
         </w:rPr>
-        <w:t>SQL Server, SSIS, Azure, SSRS</w:t>
+        <w:t>SQL Server, SSIS, Azure and SSRS</w:t>
       </w:r>
     </w:p>
     <w:p>
       <w:pPr>
-        <w:spacing w:before="80" w:after="0"/>
+        <w:keepNext/>
+        <w:pageBreakBefore w:val="0"/>
+        <w:spacing w:before="90" w:after="10"/>
       </w:pPr>
       <w:r>
         <w:rPr>
+          <w:rFonts w:ascii="Aptos" w:hAnsi="Aptos"/>
           <w:b/>
           <w:i w:val="0"/>
+          <w:color w:val="222222"/>
+          <w:sz w:val="20"/>
         </w:rPr>
         <w:t>DBA / SQL and BI Consultant | Gold Data Networks</w:t>
       </w:r>
+    </w:p>
+    <w:p>
+      <w:pPr>
+        <w:keepNext/>
+        <w:spacing w:after="30"/>
+      </w:pPr>
       <w:r>
         <w:rPr>
+          <w:rFonts w:ascii="Aptos" w:hAnsi="Aptos"/>
           <w:b w:val="0"/>
           <w:i/>
-          <w:sz w:val="18"/>
+          <w:color w:val="5B5B5B"/>
+          <w:sz w:val="17"/>
         </w:rPr>
-        <w:br/>
         <w:t>January 2016 - February 2020 | Panama City, Panama</w:t>
       </w:r>
     </w:p>
     <w:p>
       <w:pPr>
         <w:pStyle w:val="ListBullet"/>
-        <w:spacing w:after="30" w:line="245" w:lineRule="auto"/>
+        <w:keepLines/>
+        <w:spacing w:after="20" w:line="242" w:lineRule="auto"/>
+        <w:ind w:left="259" w:hanging="173"/>
       </w:pPr>
       <w:r>
-        <w:t>Built relational databases and table structures from the ground up to support dynamic web applications and reporting workloads.</w:t>
+        <w:rPr>
+          <w:rFonts w:ascii="Aptos" w:hAnsi="Aptos"/>
+          <w:b w:val="0"/>
+          <w:i w:val="0"/>
+          <w:sz w:val="18"/>
+        </w:rPr>
+        <w:t>Designed relational databases, schemas, tables, stored procedures, and supporting objects for operational applications and reporting workloads.</w:t>
       </w:r>
     </w:p>
     <w:p>
       <w:pPr>
         <w:pStyle w:val="ListBullet"/>
-        <w:spacing w:after="30" w:line="245" w:lineRule="auto"/>
+        <w:keepLines/>
+        <w:spacing w:after="20" w:line="242" w:lineRule="auto"/>
+        <w:ind w:left="259" w:hanging="173"/>
       </w:pPr>
       <w:r>
-        <w:t>Developed custom database objects and stored procedures to improve application performance and support scalable backend processes.</w:t>
+        <w:rPr>
+          <w:rFonts w:ascii="Aptos" w:hAnsi="Aptos"/>
+          <w:b w:val="0"/>
+          <w:i w:val="0"/>
+          <w:sz w:val="18"/>
+        </w:rPr>
+        <w:t>Delivered database, integration, and BI solutions aligned with application performance and infrastructure requirements.</w:t>
       </w:r>
     </w:p>
     <w:p>
       <w:pPr>
-        <w:pStyle w:val="ListBullet"/>
-        <w:spacing w:after="30" w:line="245" w:lineRule="auto"/>
-      </w:pPr>
-      <w:r>
-        <w:t>Designed end-to-end data solutions integrated with existing infrastructure, BI needs, and operational reporting.</w:t>
-      </w:r>
-    </w:p>
-    <w:p>
-      <w:pPr>
-        <w:spacing w:after="40"/>
+        <w:keepLines/>
+        <w:spacing w:after="30"/>
       </w:pPr>
       <w:r>
         <w:rPr>
+          <w:rFonts w:ascii="Aptos" w:hAnsi="Aptos"/>
           <w:b/>
           <w:i w:val="0"/>
-          <w:sz w:val="18"/>
+          <w:color w:val="222222"/>
+          <w:sz w:val="17"/>
         </w:rPr>
         <w:t xml:space="preserve">Technologies: </w:t>
       </w:r>
       <w:r>
         <w:rPr>
+          <w:rFonts w:ascii="Aptos" w:hAnsi="Aptos"/>
           <w:b w:val="0"/>
           <w:i w:val="0"/>
-          <w:sz w:val="18"/>
+          <w:color w:val="5B5B5B"/>
+          <w:sz w:val="17"/>
         </w:rPr>
-        <w:t>SQL Server, SSIS, SSRS, PostgreSQL, Power BI, Excel</w:t>
+        <w:t>SQL Server, SSIS, SSRS, PostgreSQL, Power BI and Excel</w:t>
       </w:r>
     </w:p>
     <w:p>
       <w:pPr>
-        <w:spacing w:before="80" w:after="0"/>
+        <w:keepNext/>
+        <w:pageBreakBefore w:val="0"/>
+        <w:spacing w:before="90" w:after="10"/>
       </w:pPr>
       <w:r>
         <w:rPr>
+          <w:rFonts w:ascii="Aptos" w:hAnsi="Aptos"/>
           <w:b/>
           <w:i w:val="0"/>
+          <w:color w:val="222222"/>
+          <w:sz w:val="20"/>
         </w:rPr>
         <w:t>Data Warehouse DBA | BAC Credomatic</w:t>
       </w:r>
+    </w:p>
+    <w:p>
+      <w:pPr>
+        <w:keepNext/>
+        <w:spacing w:after="30"/>
+      </w:pPr>
       <w:r>
         <w:rPr>
+          <w:rFonts w:ascii="Aptos" w:hAnsi="Aptos"/>
           <w:b w:val="0"/>
           <w:i/>
-          <w:sz w:val="18"/>
+          <w:color w:val="5B5B5B"/>
+          <w:sz w:val="17"/>
         </w:rPr>
-        <w:br/>
         <w:t>November 2017 - January 2019 | San Jose, Costa Rica</w:t>
       </w:r>
     </w:p>
     <w:p>
       <w:pPr>
         <w:pStyle w:val="ListBullet"/>
-        <w:spacing w:after="30" w:line="245" w:lineRule="auto"/>
+        <w:keepLines/>
+        <w:spacing w:after="20" w:line="242" w:lineRule="auto"/>
+        <w:ind w:left="259" w:hanging="173"/>
       </w:pPr>
       <w:r>
-        <w:t>Developed and maintained ETL pipelines to load data from multiple sources into the enterprise data warehouse.</w:t>
+        <w:rPr>
+          <w:rFonts w:ascii="Aptos" w:hAnsi="Aptos"/>
+          <w:b w:val="0"/>
+          <w:i w:val="0"/>
+          <w:sz w:val="18"/>
+        </w:rPr>
+        <w:t>Developed and maintained ETL pipelines that loaded multiple source systems into the enterprise data warehouse.</w:t>
       </w:r>
     </w:p>
     <w:p>
       <w:pPr>
         <w:pStyle w:val="ListBullet"/>
-        <w:spacing w:after="30" w:line="245" w:lineRule="auto"/>
+        <w:keepLines/>
+        <w:spacing w:after="20" w:line="242" w:lineRule="auto"/>
+        <w:ind w:left="259" w:hanging="173"/>
       </w:pPr>
       <w:r>
-        <w:t>Defined and optimized table, index, and view structures for high-performance analytical workloads.</w:t>
+        <w:rPr>
+          <w:rFonts w:ascii="Aptos" w:hAnsi="Aptos"/>
+          <w:b w:val="0"/>
+          <w:i w:val="0"/>
+          <w:sz w:val="18"/>
+        </w:rPr>
+        <w:t>Designed and optimized tables, indexes, and views for reliable, high-performance analytical workloads.</w:t>
+      </w:r>
+    </w:p>
+    <w:p>
+      <w:pPr>
+        <w:keepLines/>
+        <w:spacing w:after="30"/>
+      </w:pPr>
+      <w:r>
+        <w:rPr>
+          <w:rFonts w:ascii="Aptos" w:hAnsi="Aptos"/>
+          <w:b/>
+          <w:i w:val="0"/>
+          <w:color w:val="222222"/>
+          <w:sz w:val="17"/>
+        </w:rPr>
+        <w:t xml:space="preserve">Technologies: </w:t>
+      </w:r>
+      <w:r>
+        <w:rPr>
+          <w:rFonts w:ascii="Aptos" w:hAnsi="Aptos"/>
+          <w:b w:val="0"/>
+          <w:i w:val="0"/>
+          <w:color w:val="5B5B5B"/>
+          <w:sz w:val="17"/>
+        </w:rPr>
+        <w:t>SQL Server, SSIS, SSAS, SSRS, Power BI and Azure</w:t>
+      </w:r>
+    </w:p>
+    <w:p>
+      <w:pPr>
+        <w:keepNext/>
+        <w:spacing w:before="140" w:after="60"/>
+        <w:pBdr>
+          <w:bottom w:val="single" w:sz="4" w:space="2" w:color="BDD7EE"/>
+        </w:pBdr>
+      </w:pPr>
+      <w:r>
+        <w:rPr>
+          <w:rFonts w:ascii="Aptos Display" w:hAnsi="Aptos Display"/>
+          <w:b/>
+          <w:i w:val="0"/>
+          <w:color w:val="1F4E79"/>
+          <w:sz w:val="20"/>
+        </w:rPr>
+        <w:t>ADDITIONAL DATABASE EXPERIENCE</w:t>
       </w:r>
     </w:p>
     <w:p>
       <w:pPr>
         <w:pStyle w:val="ListBullet"/>
-        <w:spacing w:after="30" w:line="245" w:lineRule="auto"/>
-      </w:pPr>
-      <w:r>
-        <w:t>Supported reporting and analysis needs by identifying trends and patterns in large datasets for business decision-making.</w:t>
-      </w:r>
-    </w:p>
-    <w:p>
-      <w:pPr>
-        <w:spacing w:after="40"/>
+        <w:keepLines/>
+        <w:spacing w:after="20" w:line="242" w:lineRule="auto"/>
+        <w:ind w:left="259" w:hanging="173"/>
       </w:pPr>
       <w:r>
         <w:rPr>
-          <w:b/>
-          <w:i w:val="0"/>
-          <w:sz w:val="18"/>
-        </w:rPr>
-        <w:t xml:space="preserve">Technologies: </w:t>
-      </w:r>
-      <w:r>
-        <w:rPr>
+          <w:rFonts w:ascii="Aptos" w:hAnsi="Aptos"/>
           <w:b w:val="0"/>
           <w:i w:val="0"/>
-          <w:sz w:val="18"/>
+          <w:sz w:val="17"/>
         </w:rPr>
-        <w:t>SQL Server, SSIS, SSAS, Power BI, SSRS, Azure</w:t>
-      </w:r>
-    </w:p>
-    <w:p>
-      <w:pPr>
-        <w:pStyle w:val="Heading1"/>
-        <w:spacing w:before="160" w:after="60"/>
-      </w:pPr>
-      <w:r>
-        <w:t>ADDITIONAL SQL SERVER DBA AND DATABASE EXPERIENCE</w:t>
+        <w:t>Bosal, DBA and BI Consultant: designed the first stage of the main data warehouse, produced management reporting, and shared database improvement practices with development teams.</w:t>
       </w:r>
     </w:p>
     <w:p>
       <w:pPr>
         <w:pStyle w:val="ListBullet"/>
-        <w:spacing w:after="30" w:line="245" w:lineRule="auto"/>
+        <w:keepLines/>
+        <w:spacing w:after="20" w:line="242" w:lineRule="auto"/>
+        <w:ind w:left="259" w:hanging="173"/>
       </w:pPr>
       <w:r>
-        <w:t>Bosal, DBA and BI Consultant: designed the first stage of the main data warehouse, generated senior-management reports, and shared database improvement practices with development teams. Technologies: SQL Server, SSIS, Azure, MySQL, Power BI.</w:t>
+        <w:rPr>
+          <w:rFonts w:ascii="Aptos" w:hAnsi="Aptos"/>
+          <w:b w:val="0"/>
+          <w:i w:val="0"/>
+          <w:sz w:val="17"/>
+        </w:rPr>
+        <w:t>Xetux Solutions, Database Manager: defined database-management policies and improved performance and data security across business areas.</w:t>
       </w:r>
     </w:p>
     <w:p>
       <w:pPr>
         <w:pStyle w:val="ListBullet"/>
-        <w:spacing w:after="30" w:line="245" w:lineRule="auto"/>
+        <w:keepLines/>
+        <w:spacing w:after="20" w:line="242" w:lineRule="auto"/>
+        <w:ind w:left="259" w:hanging="173"/>
       </w:pPr>
       <w:r>
-        <w:t>Xetux Solutions, Database Manager: defined database management policies and improved performance and data security across business areas. Technologies: SQL Server, SSIS, SSRS, Azure.</w:t>
+        <w:rPr>
+          <w:rFonts w:ascii="Aptos" w:hAnsi="Aptos"/>
+          <w:b w:val="0"/>
+          <w:i w:val="0"/>
+          <w:sz w:val="17"/>
+        </w:rPr>
+        <w:t>ACH Cloud Services, SQL and BI Consultant: administered and developed databases, created operational reporting, and documented the data environment.</w:t>
       </w:r>
     </w:p>
     <w:p>
       <w:pPr>
         <w:pStyle w:val="ListBullet"/>
-        <w:spacing w:after="30" w:line="245" w:lineRule="auto"/>
+        <w:keepLines/>
+        <w:spacing w:after="20" w:line="242" w:lineRule="auto"/>
+        <w:ind w:left="259" w:hanging="173"/>
       </w:pPr>
       <w:r>
-        <w:t>ACH Cloud Services, SQL and BI Consultant: administered and developed company databases, created billing dashboards, and documented the data environment. Technologies: SQL Server, SSIS, SSRS, Azure.</w:t>
+        <w:rPr>
+          <w:rFonts w:ascii="Aptos" w:hAnsi="Aptos"/>
+          <w:b w:val="0"/>
+          <w:i w:val="0"/>
+          <w:sz w:val="17"/>
+        </w:rPr>
+        <w:t>EducaTablet and VIGEOSOFT, Microsoft SQL Server DBA: administered production databases, improved database process response times, modeled OLTP systems, and trained development teams.</w:t>
       </w:r>
     </w:p>
     <w:p>
       <w:pPr>
         <w:pStyle w:val="ListBullet"/>
-        <w:spacing w:after="30" w:line="245" w:lineRule="auto"/>
+        <w:keepLines/>
+        <w:spacing w:after="20" w:line="242" w:lineRule="auto"/>
+        <w:ind w:left="259" w:hanging="173"/>
       </w:pPr>
       <w:r>
-        <w:t>EducaTablet, Microsoft SQL Server DBA: administered and developed company databases, improved response times for database processes, and trained development teams on database programming practices.</w:t>
+        <w:rPr>
+          <w:rFonts w:ascii="Aptos" w:hAnsi="Aptos"/>
+          <w:b w:val="0"/>
+          <w:i w:val="0"/>
+          <w:sz w:val="17"/>
+        </w:rPr>
+        <w:t>Optica Caroni, Developer Analyst: delivered production workflow, database, and reporting projects using SQL Server, SSIS, SSRS, .NET, and VB6.</w:t>
       </w:r>
     </w:p>
     <w:p>
       <w:pPr>
-        <w:pStyle w:val="ListBullet"/>
-        <w:spacing w:after="30" w:line="245" w:lineRule="auto"/>
+        <w:keepNext/>
+        <w:spacing w:before="140" w:after="60"/>
+        <w:pBdr>
+          <w:bottom w:val="single" w:sz="4" w:space="2" w:color="BDD7EE"/>
+        </w:pBdr>
       </w:pPr>
       <w:r>
-        <w:t>VIGEOSOFT, Microsoft SQL Server DBA: modeled, designed, configured, and programmed OLTP databases for business applications, including data dictionary practices and stakeholder coordination.</w:t>
+        <w:rPr>
+          <w:rFonts w:ascii="Aptos Display" w:hAnsi="Aptos Display"/>
+          <w:b/>
+          <w:i w:val="0"/>
+          <w:color w:val="1F4E79"/>
+          <w:sz w:val="20"/>
+        </w:rPr>
+        <w:t>EDUCATION AND LANGUAGES</w:t>
       </w:r>
     </w:p>
     <w:p>
       <w:pPr>
-        <w:pStyle w:val="ListBullet"/>
-        <w:spacing w:after="30" w:line="245" w:lineRule="auto"/>
+        <w:spacing w:after="20"/>
       </w:pPr>
       <w:r>
-        <w:t>Optica Caroni C.A., Developer Analyst: implemented production workflow and reporting projects using SQL Server, SSIS, SSRS, .NET, and VB6.</w:t>
-      </w:r>
-    </w:p>
-    <w:p>
-      <w:pPr>
-        <w:pStyle w:val="Heading1"/>
-        <w:spacing w:before="160" w:after="60"/>
-      </w:pPr>
-      <w:r>
-        <w:t>EDUCATION AND CERTIFICATIONS</w:t>
-      </w:r>
-    </w:p>
-    <w:p>
-      <w:pPr>
-        <w:pStyle w:val="ListBullet"/>
-        <w:spacing w:after="30" w:line="245" w:lineRule="auto"/>
-      </w:pPr>
-      <w:r>
+        <w:rPr>
+          <w:rFonts w:ascii="Aptos" w:hAnsi="Aptos"/>
+          <w:b w:val="0"/>
+          <w:i w:val="0"/>
+          <w:sz w:val="18"/>
+        </w:rPr>
         <w:t>Systems Analyst, Informatics - IUT Dr. Federico Rivero Palacio (2000 - 2004)</w:t>
       </w:r>
     </w:p>
     <w:p>
       <w:pPr>
-        <w:pStyle w:val="ListBullet"/>
-        <w:spacing w:after="30" w:line="245" w:lineRule="auto"/>
+        <w:spacing w:after="20"/>
       </w:pPr>
       <w:r>
-        <w:t>English Certificate - Universidad Central de Venezuela / Microsoft (2013 - 2015)</w:t>
-      </w:r>
-    </w:p>
-    <w:p>
-      <w:pPr>
-        <w:pStyle w:val="ListBullet"/>
-        <w:spacing w:after="30" w:line="245" w:lineRule="auto"/>
-      </w:pPr>
-      <w:r>
-        <w:t>Analyzing and Visualizing Data with Power BI; Complete Data Science Training with Python for Data Analysis; R Programming A-Z; Dataiku Core Designer; SQL Admin Part 1</w:t>
-      </w:r>
-    </w:p>
-    <w:p>
-      <w:pPr>
-        <w:pStyle w:val="Heading1"/>
-        <w:spacing w:before="160" w:after="60"/>
-      </w:pPr>
-      <w:r>
-        <w:t>LANGUAGES</w:t>
+        <w:rPr>
+          <w:rFonts w:ascii="Aptos" w:hAnsi="Aptos"/>
+          <w:b w:val="0"/>
+          <w:i w:val="0"/>
+          <w:sz w:val="18"/>
+        </w:rPr>
+        <w:t>Training: SQL Admin Part 1; Analyzing and Visualizing Data with Power BI; Dataiku Core Designer; Python for Data Analysis</w:t>
       </w:r>
     </w:p>
     <w:p>
       <w:r>
+        <w:rPr>
+          <w:rFonts w:ascii="Aptos" w:hAnsi="Aptos"/>
+          <w:b w:val="0"/>
+          <w:i w:val="0"/>
+          <w:sz w:val="18"/>
+        </w:rPr>
         <w:t>Spanish: Native | English: Full Professional</w:t>
       </w:r>
     </w:p>
     <w:sectPr>
       <w:pgSz w:w="12240" w:h="15840"/>
-      <w:pgMar w:top="648" w:right="792" w:bottom="648" w:left="792" w:header="720" w:footer="720" w:gutter="0"/>
+      <w:pgMar w:top="619" w:right="792" w:bottom="619" w:left="792" w:header="720" w:footer="720" w:gutter="0"/>
       <w:cols w:space="720"/>
       <w:docGrid w:linePitch="360"/>
     </w:sectPr>
   </w:body>
 </w:document>
+</file>
+
+<file path=word/footer1.xml><?xml version="1.0" encoding="utf-8"?>
+<w:ftr xmlns:m="http://schemas.openxmlformats.org/officeDocument/2006/math" xmlns:mc="http://schemas.openxmlformats.org/markup-compatibility/2006" xmlns:mo="http://schemas.microsoft.com/office/mac/office/2008/main" xmlns:mv="urn:schemas-microsoft-com:mac:vml" xmlns:o="urn:schemas-microsoft-com:office:office" xmlns:r="http://schemas.openxmlformats.org/officeDocument/2006/relationships" xmlns:v="urn:schemas-microsoft-com:vml" xmlns:w10="urn:schemas-microsoft-com:office:word" xmlns:w14="http://schemas.microsoft.com/office/word/2010/wordml" xmlns:w="http://schemas.openxmlformats.org/wordprocessingml/2006/main" xmlns:wne="http://schemas.microsoft.com/office/word/2006/wordml" xmlns:wp14="http://schemas.microsoft.com/office/word/2010/wordprocessingDrawing" xmlns:wp="http://schemas.openxmlformats.org/drawingml/2006/wordprocessingDrawing" xmlns:wpc="http://schemas.microsoft.com/office/word/2010/wordprocessingCanvas" xmlns:wpg="http://schemas.microsoft.com/office/word/2010/wordprocessingGroup" xmlns:wpi="http://schemas.microsoft.com/office/word/2010/wordprocessingInk" xmlns:wps="http://schemas.microsoft.com/office/word/2010/wordprocessingShape" mc:Ignorable="w14 wp14">
+  <w:p>
+    <w:pPr>
+      <w:pStyle w:val="Footer"/>
+    </w:pPr>
+  </w:p>
+</w:ftr>
+</file>
+
+<file path=word/header1.xml><?xml version="1.0" encoding="utf-8"?>
+<w:hdr xmlns:m="http://schemas.openxmlformats.org/officeDocument/2006/math" xmlns:mc="http://schemas.openxmlformats.org/markup-compatibility/2006" xmlns:mo="http://schemas.microsoft.com/office/mac/office/2008/main" xmlns:mv="urn:schemas-microsoft-com:mac:vml" xmlns:o="urn:schemas-microsoft-com:office:office" xmlns:r="http://schemas.openxmlformats.org/officeDocument/2006/relationships" xmlns:v="urn:schemas-microsoft-com:vml" xmlns:w10="urn:schemas-microsoft-com:office:word" xmlns:w14="http://schemas.microsoft.com/office/word/2010/wordml" xmlns:w="http://schemas.openxmlformats.org/wordprocessingml/2006/main" xmlns:wne="http://schemas.microsoft.com/office/word/2006/wordml" xmlns:wp14="http://schemas.microsoft.com/office/word/2010/wordprocessingDrawing" xmlns:wp="http://schemas.openxmlformats.org/drawingml/2006/wordprocessingDrawing" xmlns:wpc="http://schemas.microsoft.com/office/word/2010/wordprocessingCanvas" xmlns:wpg="http://schemas.microsoft.com/office/word/2010/wordprocessingGroup" xmlns:wpi="http://schemas.microsoft.com/office/word/2010/wordprocessingInk" xmlns:wps="http://schemas.microsoft.com/office/word/2010/wordprocessingShape" mc:Ignorable="w14 wp14">
+  <w:p>
+    <w:pPr>
+      <w:pStyle w:val="Header"/>
+    </w:pPr>
+  </w:p>
+</w:hdr>
 </file>
 
 <file path=word/numbering.xml><?xml version="1.0" encoding="utf-8"?>
@@ -1402,10 +1788,10 @@
     <w:qFormat/>
     <w:rsid w:val="00FC693F"/>
     <w:pPr>
-      <w:spacing w:after="40" w:line="247" w:lineRule="auto"/>
+      <w:spacing w:after="40"/>
     </w:pPr>
     <w:rPr>
-      <w:rFonts w:ascii="Calibri" w:hAnsi="Calibri"/>
+      <w:rFonts w:ascii="Aptos" w:hAnsi="Aptos"/>
       <w:sz w:val="18"/>
     </w:rPr>
   </w:style>
@@ -1468,10 +1854,11 @@
       <w:outlineLvl w:val="0"/>
     </w:pPr>
     <w:rPr>
-      <w:rFonts w:asciiTheme="majorHAnsi" w:eastAsiaTheme="majorEastAsia" w:hAnsiTheme="majorHAnsi" w:cstheme="majorBidi" w:ascii="Calibri" w:hAnsi="Calibri"/>
+      <w:rFonts w:asciiTheme="majorHAnsi" w:eastAsiaTheme="majorEastAsia" w:hAnsiTheme="majorHAnsi" w:cstheme="majorBidi"/>
       <w:b/>
       <w:bCs/>
-      <w:sz w:val="21"/>
+      <w:color w:val="365F91" w:themeColor="accent1" w:themeShade="BF"/>
+      <w:sz w:val="28"/>
       <w:szCs w:val="28"/>
     </w:rPr>
   </w:style>
@@ -1752,15 +2139,15 @@
       <w:pBdr>
         <w:bottom w:val="single" w:sz="8" w:space="4" w:color="4F81BD" w:themeColor="accent1"/>
       </w:pBdr>
-      <w:spacing w:after="0" w:line="240" w:lineRule="auto"/>
+      <w:spacing w:after="300" w:line="240" w:lineRule="auto"/>
       <w:contextualSpacing/>
     </w:pPr>
     <w:rPr>
-      <w:rFonts w:asciiTheme="majorHAnsi" w:eastAsiaTheme="majorEastAsia" w:hAnsiTheme="majorHAnsi" w:cstheme="majorBidi" w:ascii="Calibri" w:hAnsi="Calibri"/>
-      <w:b/>
+      <w:rFonts w:asciiTheme="majorHAnsi" w:eastAsiaTheme="majorEastAsia" w:hAnsiTheme="majorHAnsi" w:cstheme="majorBidi"/>
+      <w:color w:val="17365D" w:themeColor="text2" w:themeShade="BF"/>
       <w:spacing w:val="5"/>
       <w:kern w:val="28"/>
-      <w:sz w:val="34"/>
+      <w:sz w:val="52"/>
       <w:szCs w:val="52"/>
     </w:rPr>
   </w:style>
@@ -1934,11 +2321,10 @@
       <w:numPr>
         <w:numId w:val="1"/>
       </w:numPr>
-      <w:ind w:left="259" w:hanging="173"/>
       <w:contextualSpacing/>
     </w:pPr>
     <w:rPr>
-      <w:rFonts w:ascii="Calibri" w:hAnsi="Calibri"/>
+      <w:rFonts w:ascii="Aptos" w:hAnsi="Aptos"/>
       <w:sz w:val="18"/>
     </w:rPr>
   </w:style>
@@ -1952,13 +2338,8 @@
       <w:numPr>
         <w:numId w:val="2"/>
       </w:numPr>
-      <w:ind w:left="259" w:hanging="173"/>
       <w:contextualSpacing/>
     </w:pPr>
-    <w:rPr>
-      <w:rFonts w:ascii="Calibri" w:hAnsi="Calibri"/>
-      <w:sz w:val="18"/>
-    </w:rPr>
   </w:style>
   <w:style w:type="paragraph" w:styleId="ListBullet3">
     <w:name w:val="List Bullet 3"/>

</xml_diff>